<commit_message>
Fix week 2 time log entries
</commit_message>
<xml_diff>
--- a/Time Log Week 2 - Lev Lavryniuk.docx
+++ b/Time Log Week 2 - Lev Lavryniuk.docx
@@ -134,7 +134,7 @@
               <w:pStyle w:val="Compact"/>
             </w:pPr>
             <w:r>
-              <w:t>Team meeting, prepared project overview section of the Phase 1 document</w:t>
+              <w:t>Team meeting</w:t>
             </w:r>
           </w:p>
         </w:tc>
@@ -173,7 +173,7 @@
               <w:pStyle w:val="Compact"/>
             </w:pPr>
             <w:r>
-              <w:t>11:54 am</w:t>
+              <w:t>11:20 am</w:t>
             </w:r>
           </w:p>
         </w:tc>
@@ -186,7 +186,74 @@
               <w:pStyle w:val="Compact"/>
             </w:pPr>
             <w:r>
-              <w:t>44 min</w:t>
+              <w:t>10 min</w:t>
+            </w:r>
+          </w:p>
+        </w:tc>
+      </w:tr>
+      <w:tr>
+        <w:tc>
+          <w:tcPr>
+            <w:tcW w:w="1584" w:type="dxa"/>
+          </w:tcPr>
+          <w:p>
+            <w:pPr>
+              <w:pStyle w:val="Compact"/>
+            </w:pPr>
+            <w:r>
+              <w:t>Prepared project overview section of the Phase 1 document</w:t>
+            </w:r>
+          </w:p>
+        </w:tc>
+        <w:tc>
+          <w:tcPr>
+            <w:tcW w:w="1584" w:type="dxa"/>
+          </w:tcPr>
+          <w:p>
+            <w:pPr>
+              <w:pStyle w:val="Compact"/>
+            </w:pPr>
+            <w:r>
+              <w:t>09/26/26</w:t>
+            </w:r>
+          </w:p>
+        </w:tc>
+        <w:tc>
+          <w:tcPr>
+            <w:tcW w:w="1584" w:type="dxa"/>
+          </w:tcPr>
+          <w:p>
+            <w:pPr>
+              <w:pStyle w:val="Compact"/>
+            </w:pPr>
+            <w:r>
+              <w:t>12:10 pm</w:t>
+            </w:r>
+          </w:p>
+        </w:tc>
+        <w:tc>
+          <w:tcPr>
+            <w:tcW w:w="1584" w:type="dxa"/>
+          </w:tcPr>
+          <w:p>
+            <w:pPr>
+              <w:pStyle w:val="Compact"/>
+            </w:pPr>
+            <w:r>
+              <w:t>1:40 pm</w:t>
+            </w:r>
+          </w:p>
+        </w:tc>
+        <w:tc>
+          <w:tcPr>
+            <w:tcW w:w="1584" w:type="dxa"/>
+          </w:tcPr>
+          <w:p>
+            <w:pPr>
+              <w:pStyle w:val="Compact"/>
+            </w:pPr>
+            <w:r>
+              <w:t>1 h 30 min</w:t>
             </w:r>
           </w:p>
         </w:tc>
@@ -197,7 +264,7 @@
         <w:pStyle w:val="a0"/>
       </w:pPr>
       <w:r>
-        <w:t>Week total: 44 min</w:t>
+        <w:t>Week total: 1 h 40 min</w:t>
       </w:r>
     </w:p>
     <w:sectPr>

</xml_diff>